<commit_message>
Chapter 12 · L-글루타민(L-Glutamine) · verified 38/38 + edited
- reference-validator: 38/38 참고문헌 CrossRef+PubMed 4단계 DOI 검증 완료(100%, 실패 0)
  · 정본 validate_chapter.py 사용 · 로그 validation-log-ch12-glutamine-2026-07-17.csv
- chapter-editor: KFDA 준수(declarative 위반 0) · 용어 3중표기 보완(장-뇌축·사군자탕)
  · 인용정합성 본문[1]-[38] 대 목록 1:1 · 할루시네이션 0(전 DOI ch12.bib 유래)
  · 헤더/상태노트/메타 검증·편집 완료 상태 갱신 · edit-log-ch12 작성
- output: ch12-glutamine.docx 및 Ch1-12 통합본 재생성(검증·편집본 반영)

Co-Authored-By: Claude Opus 4.8 (1M context) <noreply@anthropic.com>
</commit_message>
<xml_diff>
--- a/output/ch12-glutamine.docx
+++ b/output/ch12-glutamine.docx
@@ -35,7 +35,7 @@
         <w:rPr>
           <w:rFonts w:ascii="Malgun Gothic" w:hAnsi="Malgun Gothic" w:eastAsia="Malgun Gothic"/>
         </w:rPr>
-        <w:t>참고문헌: 38편 · 검증 완료 0편 · [PENDING] 38편</w:t>
+        <w:t>참고문헌: 38편 · 검증 완료 38편 · [PENDING] 0편 (검증률 100%)</w:t>
       </w:r>
     </w:p>
     <w:p>
@@ -43,7 +43,7 @@
         <w:rPr>
           <w:rFonts w:ascii="Malgun Gothic" w:hAnsi="Malgun Gothic" w:eastAsia="Malgun Gothic"/>
         </w:rPr>
-        <w:t>최종 검증 실행일: [reference-validator 실행 후 자동 갱신]</w:t>
+        <w:t>최종 검증 실행일: 2026-07-17 · reference-validator Skill v1.0 (CrossRef + PubMed 4단계)</w:t>
       </w:r>
     </w:p>
     <w:p>
@@ -51,7 +51,7 @@
         <w:rPr>
           <w:rFonts w:ascii="Malgun Gothic" w:hAnsi="Malgun Gothic" w:eastAsia="Malgun Gothic"/>
         </w:rPr>
-        <w:t>사료 검증: 해당 없음(아미노산 · 조선 사료 최소화 방침 · 전통의학 은유는 배경 사실만)</w:t>
+        <w:t>검증 로그: references/validation-log-ch12-glutamine-2026-07-17.csv</w:t>
       </w:r>
     </w:p>
     <w:p>
@@ -59,7 +59,7 @@
         <w:rPr>
           <w:rFonts w:ascii="Malgun Gothic" w:hAnsi="Malgun Gothic" w:eastAsia="Malgun Gothic"/>
         </w:rPr>
-        <w:t>AI 초안 도구: Claude Opus 4.8 · chapter-drafter Skill v1.0 (15섹션 표준 템플릿)</w:t>
+        <w:t>사료 검증: 해당 없음 (L-글루타민은 19세기 분리·동정된 아미노산 · 조선 사료 직접 인용 없음 · 전통의학은 배경 은유만)</w:t>
       </w:r>
     </w:p>
     <w:p>
@@ -67,7 +67,7 @@
         <w:rPr>
           <w:rFonts w:ascii="Malgun Gothic" w:hAnsi="Malgun Gothic" w:eastAsia="Malgun Gothic"/>
         </w:rPr>
-        <w:t>편집: [chapter-editor 실행 전]</w:t>
+        <w:t>AI 초안 도구: Claude Opus 4.8 · chapter-drafter Skill v1.0</w:t>
       </w:r>
     </w:p>
     <w:p>
@@ -75,7 +75,23 @@
         <w:rPr>
           <w:rFonts w:ascii="Malgun Gothic" w:hAnsi="Malgun Gothic" w:eastAsia="Malgun Gothic"/>
         </w:rPr>
-        <w:t>저자 검토: [ ] 미완료</w:t>
+        <w:t>편집: chapter-editor Skill v1.0 · 2026-07-17 (KFDA 준수 · 용어 통일 · 인용번호 정리 · 톤 점검)</w:t>
+      </w:r>
+    </w:p>
+    <w:p>
+      <w:r>
+        <w:rPr>
+          <w:rFonts w:ascii="Malgun Gothic" w:hAnsi="Malgun Gothic" w:eastAsia="Malgun Gothic"/>
+        </w:rPr>
+        <w:t>편집 로그: references/edit-log-ch12-2026-07-17.md</w:t>
+      </w:r>
+    </w:p>
+    <w:p>
+      <w:r>
+        <w:rPr>
+          <w:rFonts w:ascii="Malgun Gothic" w:hAnsi="Malgun Gothic" w:eastAsia="Malgun Gothic"/>
+        </w:rPr>
+        <w:t>저자 검토: [ ] 미완료 (편집 완료 · 최성화 교수 최종 승인 대기)</w:t>
       </w:r>
     </w:p>
     <w:p>
@@ -146,31 +162,19 @@
         <w:rPr>
           <w:rFonts w:ascii="Malgun Gothic" w:hAnsi="Malgun Gothic" w:eastAsia="Malgun Gothic"/>
         </w:rPr>
-        <w:t xml:space="preserve"> 이다 — 장벽 투과성·특정 임상 상황(외상·수술·감염후 과민성장)에서는 관련성이 보고되나, 안정된 건강인의 일반적 인지·운동 향상 근거는 제한적이고, 불안정한 중증에서는 오히려 신중해야 한다. 본문의 모든 학술 인용에는 </w:t>
-      </w:r>
-      <w:r>
-        <w:rPr>
-          <w:rFonts w:ascii="Malgun Gothic" w:hAnsi="Malgun Gothic" w:eastAsia="Malgun Gothic"/>
-        </w:rPr>
-        <w:t>[PENDING-DOI-VERIFY]</w:t>
-      </w:r>
-      <w:r>
-        <w:rPr>
-          <w:rFonts w:ascii="Malgun Gothic" w:hAnsi="Malgun Gothic" w:eastAsia="Malgun Gothic"/>
-        </w:rPr>
-        <w:t xml:space="preserve"> 태그가 부착되어 있으며, reference-validator(단계 ③) 검증 후 </w:t>
-      </w:r>
-      <w:r>
-        <w:rPr>
-          <w:rFonts w:ascii="Malgun Gothic" w:hAnsi="Malgun Gothic" w:eastAsia="Malgun Gothic"/>
-        </w:rPr>
-        <w:t>[DOI-VERIFIED ✓]</w:t>
-      </w:r>
-      <w:r>
-        <w:rPr>
-          <w:rFonts w:ascii="Malgun Gothic" w:hAnsi="Malgun Gothic" w:eastAsia="Malgun Gothic"/>
-        </w:rPr>
-        <w:t>로 전환된다.</w:t>
+        <w:t xml:space="preserve"> 이다 — 장벽 투과성·특정 임상 상황(외상·수술·감염후 과민성장)에서는 관련성이 보고되나, 안정된 건강인의 일반적 인지·운동 향상 근거는 제한적이고, 불안정한 중증에서는 오히려 신중해야 한다. 본문의 38개 학술 인용은 CrossRef·PubMed 4단계 검증을 통과해 </w:t>
+      </w:r>
+      <w:r>
+        <w:rPr>
+          <w:rFonts w:ascii="Malgun Gothic" w:hAnsi="Malgun Gothic" w:eastAsia="Malgun Gothic"/>
+        </w:rPr>
+        <w:t>[DOI-VERIFIED 2026-07-17 ✓]</w:t>
+      </w:r>
+      <w:r>
+        <w:rPr>
+          <w:rFonts w:ascii="Malgun Gothic" w:hAnsi="Malgun Gothic" w:eastAsia="Malgun Gothic"/>
+        </w:rPr>
+        <w:t xml:space="preserve"> 태그가 부착되었으며(검증률 100%), KFDA 표시광고 준수 점검(치료·예방·완치·특효 등 의약품 효능 어사 배제 · 근거수준 표현 적용)을 완료하였다. 저자(최성화 교수)의 최종 검토·승인이 남아 있다.</w:t>
       </w:r>
     </w:p>
     <w:p>
@@ -416,7 +420,7 @@
         <w:rPr>
           <w:rFonts w:ascii="Malgun Gothic" w:hAnsi="Malgun Gothic" w:eastAsia="Malgun Gothic"/>
         </w:rPr>
-        <w:t xml:space="preserve"> 힘뇌장의 철학은 장-뇌축(제3장)에서 출발한다 — 뇌를 돌보려면 먼저 장을 돌봐야 한다. 그런데 장-뇌축이 작동하려면 장벽 자체가 온전해야 한다. 글루타민은 장 상피세포의 1차 연료로서 세포 증식과 밀착연접을 지탱하여 장벽 무결성에 관여하며[5][10][9], 성인에서 글루타민 보충과 장 투과성의 관련성을 종합한 메타분석[32]도 이 주제를 검토했다. 글루타민은 "장-뇌축이 서 있는 성벽의 병참"이라는 점에서 힘뇌장의 토대와 직결된다.</w:t>
+        <w:t xml:space="preserve"> 힘뇌장의 철학은 장-뇌축(gut-brain axis, 腸-腦軸, 제3장)에서 출발한다 — 뇌를 돌보려면 먼저 장을 돌봐야 한다. 그런데 장-뇌축이 작동하려면 장벽 자체가 온전해야 한다. 글루타민은 장 상피세포의 1차 연료로서 세포 증식과 밀착연접을 지탱하여 장벽 무결성에 관여하며[5][10][9], 성인에서 글루타민 보충과 장 투과성의 관련성을 종합한 메타분석[32]도 이 주제를 검토했다. 글루타민은 "장-뇌축이 서 있는 성벽의 병참"이라는 점에서 힘뇌장의 토대와 직결된다.</w:t>
       </w:r>
     </w:p>
     <w:p>
@@ -527,7 +531,7 @@
         <w:rPr>
           <w:rFonts w:ascii="Malgun Gothic" w:hAnsi="Malgun Gothic" w:eastAsia="Malgun Gothic"/>
         </w:rPr>
-        <w:t>한의학은 비위를 후천지본, 곧 태어난 뒤 생명을 지탱하는 근본으로 보았다. 음식을 받아들여 기혈(氣血)로 바꾸는 운화(運化) 기능이 비위에 있으며, 비위가 튼튼해야 온몸이 자양된다는 관점이다. 글루타민이 장 상피의 연료가 되어 소화관 벽을 지탱한다는 현대적 이해는, 이 "소화관을 만병의 토대로 보는" 관점과 은유적으로 이어진다[5][10]. 힘뇌장이 사군자탕(제4~7장)으로 비위를 보하여 흡수의 토대를 세운다면, 글루타민은 그 토대인 장벽 자체의 연료를 대는 셈이다.</w:t>
+        <w:t>한의학은 비위를 후천지본, 곧 태어난 뒤 생명을 지탱하는 근본으로 보았다. 음식을 받아들여 기혈(氣血)로 바꾸는 운화(運化) 기능이 비위에 있으며, 비위가 튼튼해야 온몸이 자양된다는 관점이다. 글루타민이 장 상피의 연료가 되어 소화관 벽을 지탱한다는 현대적 이해는, 이 "소화관을 만병의 토대로 보는" 관점과 은유적으로 이어진다[5][10]. 힘뇌장이 사군자탕(四君子湯, Sagunjatang, 제4~7장)으로 비위를 보하여 흡수의 토대를 세운다면, 글루타민은 그 토대인 장벽 자체의 연료를 대는 셈이다.</w:t>
       </w:r>
     </w:p>
     <w:p>
@@ -2950,19 +2954,31 @@
         <w:rPr>
           <w:rFonts w:ascii="Malgun Gothic" w:hAnsi="Malgun Gothic" w:eastAsia="Malgun Gothic"/>
         </w:rPr>
-        <w:t xml:space="preserve">(PubMed 실측 수집)에서 인용한 실존 문헌이며, reference-validator(단계 ③) 4단계 검증 전까지 </w:t>
-      </w:r>
-      <w:r>
-        <w:rPr>
-          <w:rFonts w:ascii="Malgun Gothic" w:hAnsi="Malgun Gothic" w:eastAsia="Malgun Gothic"/>
-        </w:rPr>
-        <w:t>[PENDING-DOI-VERIFY]</w:t>
-      </w:r>
-      <w:r>
-        <w:rPr>
-          <w:rFonts w:ascii="Malgun Gothic" w:hAnsi="Malgun Gothic" w:eastAsia="Malgun Gothic"/>
-        </w:rPr>
-        <w:t xml:space="preserve"> 상태다. L-글루타민은 문헌 규모가 크므로, off-topic(암 대사 glutaminolysis·순수 효소학·축산 종·피부 등)을 엄격히 배제하고 장 상피·장벽·장-뇌축·글루타메이트 회로·면역·임상(중증/외상/IBS)·안전성 문헌만 인용하였다.</w:t>
+        <w:t xml:space="preserve">(PubMed 실측 수집)에서 인용한 실존 문헌이며, reference-validator(단계 ③)의 CrossRef·PubMed 4단계 검증을 38편 전부 통과하여 </w:t>
+      </w:r>
+      <w:r>
+        <w:rPr>
+          <w:rFonts w:ascii="Malgun Gothic" w:hAnsi="Malgun Gothic" w:eastAsia="Malgun Gothic"/>
+        </w:rPr>
+        <w:t>[DOI-VERIFIED 2026-07-17 ✓]</w:t>
+      </w:r>
+      <w:r>
+        <w:rPr>
+          <w:rFonts w:ascii="Malgun Gothic" w:hAnsi="Malgun Gothic" w:eastAsia="Malgun Gothic"/>
+        </w:rPr>
+        <w:t xml:space="preserve"> 태그가 부착되었다(검증률 100%, 로그: </w:t>
+      </w:r>
+      <w:r>
+        <w:rPr>
+          <w:rFonts w:ascii="Malgun Gothic" w:hAnsi="Malgun Gothic" w:eastAsia="Malgun Gothic"/>
+        </w:rPr>
+        <w:t>references/validation-log-ch12-glutamine-2026-07-17.csv</w:t>
+      </w:r>
+      <w:r>
+        <w:rPr>
+          <w:rFonts w:ascii="Malgun Gothic" w:hAnsi="Malgun Gothic" w:eastAsia="Malgun Gothic"/>
+        </w:rPr>
+        <w:t>). L-글루타민은 문헌 규모가 크므로, off-topic(암 대사 glutaminolysis·순수 효소학·축산 종·피부 등)을 엄격히 배제하고 장 상피·장벽·장-뇌축·글루타메이트 회로·면역·임상(중증/외상/IBS)·안전성 문헌만 인용하였다.</w:t>
       </w:r>
     </w:p>
     <w:p>
@@ -2970,7 +2986,7 @@
         <w:rPr>
           <w:rFonts w:ascii="Malgun Gothic" w:hAnsi="Malgun Gothic" w:eastAsia="Malgun Gothic"/>
         </w:rPr>
-        <w:t>[1] Bollhalder L, Pfeil AM, Tomonaga Y, et al. A systematic literature review and meta-analysis of randomized clinical trials of parenteral glutamine supplementation. Clinical Nutrition. 2013;32(2):213-223. doi:10.1016/j.clnu.2012.11.003. PMID:23196117. URL: https://doi.org/10.1016/j.clnu.2012.11.003. [PENDING-DOI-VERIFY]</w:t>
+        <w:t>[1] Bollhalder L, Pfeil AM, Tomonaga Y, et al. A systematic literature review and meta-analysis of randomized clinical trials of parenteral glutamine supplementation. Clinical Nutrition. 2013;32(2):213-223. doi:10.1016/j.clnu.2012.11.003. PMID:23196117. URL: https://doi.org/10.1016/j.clnu.2012.11.003. [DOI-VERIFIED 2026-07-17 ✓]</w:t>
       </w:r>
     </w:p>
     <w:p>
@@ -2978,7 +2994,7 @@
         <w:rPr>
           <w:rFonts w:ascii="Malgun Gothic" w:hAnsi="Malgun Gothic" w:eastAsia="Malgun Gothic"/>
         </w:rPr>
-        <w:t>[2] Brown JV, Moe-Byrne T, McGuire W. Glutamine supplementation for young infants with severe gastrointestinal disease. The Cochrane Database of Systematic Reviews. 2014;2014(12):CD005947. doi:10.1002/14651858.CD005947.pub4. PMID:25504522. URL: https://doi.org/10.1002/14651858.CD005947.pub4. [PENDING-DOI-VERIFY]</w:t>
+        <w:t>[2] Brown JV, Moe-Byrne T, McGuire W. Glutamine supplementation for young infants with severe gastrointestinal disease. The Cochrane Database of Systematic Reviews. 2014;2014(12):CD005947. doi:10.1002/14651858.CD005947.pub4. PMID:25504522. URL: https://doi.org/10.1002/14651858.CD005947.pub4. [DOI-VERIFIED 2026-07-17 ✓]</w:t>
       </w:r>
     </w:p>
     <w:p>
@@ -2986,7 +3002,7 @@
         <w:rPr>
           <w:rFonts w:ascii="Malgun Gothic" w:hAnsi="Malgun Gothic" w:eastAsia="Malgun Gothic"/>
         </w:rPr>
-        <w:t>[3] Tao KM, Li XQ, Yang LQ, et al. Glutamine supplementation for critically ill adults. The Cochrane Database of Systematic Reviews. 2014;2014(9):CD010050. doi:10.1002/14651858.CD010050.pub2. PMID:25199493. URL: https://doi.org/10.1002/14651858.CD010050.pub2. [PENDING-DOI-VERIFY]</w:t>
+        <w:t>[3] Tao KM, Li XQ, Yang LQ, et al. Glutamine supplementation for critically ill adults. The Cochrane Database of Systematic Reviews. 2014;2014(9):CD010050. doi:10.1002/14651858.CD010050.pub2. PMID:25199493. URL: https://doi.org/10.1002/14651858.CD010050.pub2. [DOI-VERIFIED 2026-07-17 ✓]</w:t>
       </w:r>
     </w:p>
     <w:p>
@@ -2994,7 +3010,7 @@
         <w:rPr>
           <w:rFonts w:ascii="Malgun Gothic" w:hAnsi="Malgun Gothic" w:eastAsia="Malgun Gothic"/>
         </w:rPr>
-        <w:t>[4] Wischmeyer PE, Dhaliwal R, McCall M, et al. Parenteral glutamine supplementation in critical illness: a systematic review. Critical Care. 2014;18(2):R76. doi:10.1186/cc13836. PMID:24745648. URL: https://doi.org/10.1186/cc13836. [PENDING-DOI-VERIFY]</w:t>
+        <w:t>[4] Wischmeyer PE, Dhaliwal R, McCall M, et al. Parenteral glutamine supplementation in critical illness: a systematic review. Critical Care. 2014;18(2):R76. doi:10.1186/cc13836. PMID:24745648. URL: https://doi.org/10.1186/cc13836. [DOI-VERIFIED 2026-07-17 ✓]</w:t>
       </w:r>
     </w:p>
     <w:p>
@@ -3002,7 +3018,7 @@
         <w:rPr>
           <w:rFonts w:ascii="Malgun Gothic" w:hAnsi="Malgun Gothic" w:eastAsia="Malgun Gothic"/>
         </w:rPr>
-        <w:t>[5] Wang B, Wu G, Zhou Z, et al. Glutamine and intestinal barrier function. Amino Acids. 2015;47(10):2143-2154. doi:10.1007/s00726-014-1773-4. PMID:24965526. URL: https://doi.org/10.1007/s00726-014-1773-4. [PENDING-DOI-VERIFY]</w:t>
+        <w:t>[5] Wang B, Wu G, Zhou Z, et al. Glutamine and intestinal barrier function. Amino Acids. 2015;47(10):2143-2154. doi:10.1007/s00726-014-1773-4. PMID:24965526. URL: https://doi.org/10.1007/s00726-014-1773-4. [DOI-VERIFIED 2026-07-17 ✓]</w:t>
       </w:r>
     </w:p>
     <w:p>
@@ -3010,7 +3026,7 @@
         <w:rPr>
           <w:rFonts w:ascii="Malgun Gothic" w:hAnsi="Malgun Gothic" w:eastAsia="Malgun Gothic"/>
         </w:rPr>
-        <w:t>[6] van Zanten AR, Dhaliwal R, Garrel D, et al. Enteral glutamine supplementation in critically ill patients: a systematic review and meta-analysis. Critical Care. 2015;19(1):294. doi:10.1186/s13054-015-1002-x. PMID:26283217. URL: https://doi.org/10.1186/s13054-015-1002-x. [PENDING-DOI-VERIFY]</w:t>
+        <w:t>[6] van Zanten AR, Dhaliwal R, Garrel D, et al. Enteral glutamine supplementation in critically ill patients: a systematic review and meta-analysis. Critical Care. 2015;19(1):294. doi:10.1186/s13054-015-1002-x. PMID:26283217. URL: https://doi.org/10.1186/s13054-015-1002-x. [DOI-VERIFIED 2026-07-17 ✓]</w:t>
       </w:r>
     </w:p>
     <w:p>
@@ -3018,7 +3034,7 @@
         <w:rPr>
           <w:rFonts w:ascii="Malgun Gothic" w:hAnsi="Malgun Gothic" w:eastAsia="Malgun Gothic"/>
         </w:rPr>
-        <w:t>[7] van Zanten AR. Glutamine and antioxidants: status of their use in critical illness. Current Opinion in Clinical Nutrition and Metabolic Care. 2015;18(2):179-186. doi:10.1097/MCO.0000000000000152. PMID:25590616. URL: https://doi.org/10.1097/MCO.0000000000000152. [PENDING-DOI-VERIFY]</w:t>
+        <w:t>[7] van Zanten AR. Glutamine and antioxidants: status of their use in critical illness. Current Opinion in Clinical Nutrition and Metabolic Care. 2015;18(2):179-186. doi:10.1097/MCO.0000000000000152. PMID:25590616. URL: https://doi.org/10.1097/MCO.0000000000000152. [DOI-VERIFIED 2026-07-17 ✓]</w:t>
       </w:r>
     </w:p>
     <w:p>
@@ -3026,7 +3042,7 @@
         <w:rPr>
           <w:rFonts w:ascii="Malgun Gothic" w:hAnsi="Malgun Gothic" w:eastAsia="Malgun Gothic"/>
         </w:rPr>
-        <w:t>[8] Moe-Byrne T, Brown JV, McGuire W. Glutamine supplementation to prevent morbidity and mortality in preterm infants. The Cochrane Database of Systematic Reviews. 2016;(1):CD001457. doi:10.1002/14651858.CD001457.pub5. PMID:26755330. URL: https://doi.org/10.1002/14651858.CD001457.pub5. [PENDING-DOI-VERIFY]</w:t>
+        <w:t>[8] Moe-Byrne T, Brown JV, McGuire W. Glutamine supplementation to prevent morbidity and mortality in preterm infants. The Cochrane Database of Systematic Reviews. 2016;(1):CD001457. doi:10.1002/14651858.CD001457.pub5. PMID:26755330. URL: https://doi.org/10.1002/14651858.CD001457.pub5. [DOI-VERIFIED 2026-07-17 ✓]</w:t>
       </w:r>
     </w:p>
     <w:p>
@@ -3034,7 +3050,7 @@
         <w:rPr>
           <w:rFonts w:ascii="Malgun Gothic" w:hAnsi="Malgun Gothic" w:eastAsia="Malgun Gothic"/>
         </w:rPr>
-        <w:t>[9] Achamrah N, Déchelotte P, Coëffier M. Glutamine and the regulation of intestinal permeability: from bench to bedside. Current Opinion in Clinical Nutrition and Metabolic Care. 2017;20(1):86-91. doi:10.1097/MCO.0000000000000339. PMID:27749689. URL: https://doi.org/10.1097/MCO.0000000000000339. [PENDING-DOI-VERIFY]</w:t>
+        <w:t>[9] Achamrah N, Déchelotte P, Coëffier M. Glutamine and the regulation of intestinal permeability: from bench to bedside. Current Opinion in Clinical Nutrition and Metabolic Care. 2017;20(1):86-91. doi:10.1097/MCO.0000000000000339. PMID:27749689. URL: https://doi.org/10.1097/MCO.0000000000000339. [DOI-VERIFIED 2026-07-17 ✓]</w:t>
       </w:r>
     </w:p>
     <w:p>
@@ -3042,7 +3058,7 @@
         <w:rPr>
           <w:rFonts w:ascii="Malgun Gothic" w:hAnsi="Malgun Gothic" w:eastAsia="Malgun Gothic"/>
         </w:rPr>
-        <w:t>[10] Kim MH, Kim H. The Roles of Glutamine in the Intestine and Its Implication in Intestinal Diseases. International Journal of Molecular Sciences. 2017;18(5):1051. doi:10.3390/ijms18051051. PMID:28498331. URL: https://doi.org/10.3390/ijms18051051. [PENDING-DOI-VERIFY]</w:t>
+        <w:t>[10] Kim MH, Kim H. The Roles of Glutamine in the Intestine and Its Implication in Intestinal Diseases. International Journal of Molecular Sciences. 2017;18(5):1051. doi:10.3390/ijms18051051. PMID:28498331. URL: https://doi.org/10.3390/ijms18051051. [DOI-VERIFIED 2026-07-17 ✓]</w:t>
       </w:r>
     </w:p>
     <w:p>
@@ -3050,7 +3066,7 @@
         <w:rPr>
           <w:rFonts w:ascii="Malgun Gothic" w:hAnsi="Malgun Gothic" w:eastAsia="Malgun Gothic"/>
         </w:rPr>
-        <w:t>[11] Cruzat V, Macedo Rogero M, Noel Keane K, et al. Glutamine: Metabolism and Immune Function, Supplementation and Clinical Translation. Nutrients. 2018;10(11):1564. doi:10.3390/nu10111564. PMID:30360490. URL: https://doi.org/10.3390/nu10111564. [PENDING-DOI-VERIFY]</w:t>
+        <w:t>[11] Cruzat V, Macedo Rogero M, Noel Keane K, et al. Glutamine: Metabolism and Immune Function, Supplementation and Clinical Translation. Nutrients. 2018;10(11):1564. doi:10.3390/nu10111564. PMID:30360490. URL: https://doi.org/10.3390/nu10111564. [DOI-VERIFIED 2026-07-17 ✓]</w:t>
       </w:r>
     </w:p>
     <w:p>
@@ -3058,7 +3074,7 @@
         <w:rPr>
           <w:rFonts w:ascii="Malgun Gothic" w:hAnsi="Malgun Gothic" w:eastAsia="Malgun Gothic"/>
         </w:rPr>
-        <w:t>[12] Hayashi MK. Structure-Function Relationship of Transporters in the Glutamate-Glutamine Cycle of the Central Nervous System. International Journal of Molecular Sciences. 2018;19(4):1177. doi:10.3390/ijms19041177. PMID:29649168. URL: https://doi.org/10.3390/ijms19041177. [PENDING-DOI-VERIFY]</w:t>
+        <w:t>[12] Hayashi MK. Structure-Function Relationship of Transporters in the Glutamate-Glutamine Cycle of the Central Nervous System. International Journal of Molecular Sciences. 2018;19(4):1177. doi:10.3390/ijms19041177. PMID:29649168. URL: https://doi.org/10.3390/ijms19041177. [DOI-VERIFIED 2026-07-17 ✓]</w:t>
       </w:r>
     </w:p>
     <w:p>
@@ -3066,7 +3082,7 @@
         <w:rPr>
           <w:rFonts w:ascii="Malgun Gothic" w:hAnsi="Malgun Gothic" w:eastAsia="Malgun Gothic"/>
         </w:rPr>
-        <w:t>[13] Hebron ML, Javidnia M, Moussa CE. Tau clearance improves astrocytic function and brain glutamate-glutamine cycle. Journal of the Neurological Sciences. 2018;391:90-99. doi:10.1016/j.jns.2018.06.005. PMID:30103978. URL: https://doi.org/10.1016/j.jns.2018.06.005. [PENDING-DOI-VERIFY]</w:t>
+        <w:t>[13] Hebron ML, Javidnia M, Moussa CE. Tau clearance improves astrocytic function and brain glutamate-glutamine cycle. Journal of the Neurological Sciences. 2018;391:90-99. doi:10.1016/j.jns.2018.06.005. PMID:30103978. URL: https://doi.org/10.1016/j.jns.2018.06.005. [DOI-VERIFIED 2026-07-17 ✓]</w:t>
       </w:r>
     </w:p>
     <w:p>
@@ -3074,7 +3090,7 @@
         <w:rPr>
           <w:rFonts w:ascii="Malgun Gothic" w:hAnsi="Malgun Gothic" w:eastAsia="Malgun Gothic"/>
         </w:rPr>
-        <w:t>[14] Chen Y, Tsai YH, Tseng BJ, et al. Influence of Growth Hormone and Glutamine on Intestinal Stem Cells: A Narrative Review. Nutrients. 2019;11(8):1941. doi:10.3390/nu11081941. PMID:31426533. URL: https://doi.org/10.3390/nu11081941. [PENDING-DOI-VERIFY]</w:t>
+        <w:t>[14] Chen Y, Tsai YH, Tseng BJ, et al. Influence of Growth Hormone and Glutamine on Intestinal Stem Cells: A Narrative Review. Nutrients. 2019;11(8):1941. doi:10.3390/nu11081941. PMID:31426533. URL: https://doi.org/10.3390/nu11081941. [DOI-VERIFIED 2026-07-17 ✓]</w:t>
       </w:r>
     </w:p>
     <w:p>
@@ -3082,7 +3098,7 @@
         <w:rPr>
           <w:rFonts w:ascii="Malgun Gothic" w:hAnsi="Malgun Gothic" w:eastAsia="Malgun Gothic"/>
         </w:rPr>
-        <w:t>[15] Ramezani Ahmadi A, Rayyani E, Bahreini M, et al. The effect of glutamine supplementation on athletic performance, body composition, and immune function: A systematic review and a meta-analysis of clinical trials. Clinical Nutrition. 2019;38(3):1076-1091. doi:10.1016/j.clnu.2018.05.001. PMID:29784526. URL: https://doi.org/10.1016/j.clnu.2018.05.001. [PENDING-DOI-VERIFY]</w:t>
+        <w:t>[15] Ramezani Ahmadi A, Rayyani E, Bahreini M, et al. The effect of glutamine supplementation on athletic performance, body composition, and immune function: A systematic review and a meta-analysis of clinical trials. Clinical Nutrition. 2019;38(3):1076-1091. doi:10.1016/j.clnu.2018.05.001. PMID:29784526. URL: https://doi.org/10.1016/j.clnu.2018.05.001. [DOI-VERIFIED 2026-07-17 ✓]</w:t>
       </w:r>
     </w:p>
     <w:p>
@@ -3090,7 +3106,7 @@
         <w:rPr>
           <w:rFonts w:ascii="Malgun Gothic" w:hAnsi="Malgun Gothic" w:eastAsia="Malgun Gothic"/>
         </w:rPr>
-        <w:t>[16] Shariatpanahi ZV, Eslamian G, Ardehali SH, et al. Effects of Early Enteral Glutamine Supplementation on Intestinal Permeability in Critically Ill Patients. Indian Journal of Critical Care Medicine. 2019;23(8):356-362. doi:10.5005/jp-journals-10071-23218. PMID:31485104. URL: https://doi.org/10.5005/jp-journals-10071-23218. [PENDING-DOI-VERIFY]</w:t>
+        <w:t>[16] Shariatpanahi ZV, Eslamian G, Ardehali SH, et al. Effects of Early Enteral Glutamine Supplementation on Intestinal Permeability in Critically Ill Patients. Indian Journal of Critical Care Medicine. 2019;23(8):356-362. doi:10.5005/jp-journals-10071-23218. PMID:31485104. URL: https://doi.org/10.5005/jp-journals-10071-23218. [DOI-VERIFIED 2026-07-17 ✓]</w:t>
       </w:r>
     </w:p>
     <w:p>
@@ -3098,7 +3114,7 @@
         <w:rPr>
           <w:rFonts w:ascii="Malgun Gothic" w:hAnsi="Malgun Gothic" w:eastAsia="Malgun Gothic"/>
         </w:rPr>
-        <w:t>[17] Zheng P, Zeng B, Liu M, et al. The gut microbiome from patients with schizophrenia modulates the glutamate-glutamine-GABA cycle and schizophrenia-relevant behaviors in mice. Science Advances. 2019;5(2):eaau8317. doi:10.1126/sciadv.aau8317. PMID:30775438. URL: https://doi.org/10.1126/sciadv.aau8317. [PENDING-DOI-VERIFY]</w:t>
+        <w:t>[17] Zheng P, Zeng B, Liu M, et al. The gut microbiome from patients with schizophrenia modulates the glutamate-glutamine-GABA cycle and schizophrenia-relevant behaviors in mice. Science Advances. 2019;5(2):eaau8317. doi:10.1126/sciadv.aau8317. PMID:30775438. URL: https://doi.org/10.1126/sciadv.aau8317. [DOI-VERIFIED 2026-07-17 ✓]</w:t>
       </w:r>
     </w:p>
     <w:p>
@@ -3106,7 +3122,7 @@
         <w:rPr>
           <w:rFonts w:ascii="Malgun Gothic" w:hAnsi="Malgun Gothic" w:eastAsia="Malgun Gothic"/>
         </w:rPr>
-        <w:t>[18] Zhou Q, Verne ML, Fields JZ, et al. Randomised placebo-controlled trial of dietary glutamine supplements for postinfectious irritable bowel syndrome. Gut. 2019;68(6):996-1002. doi:10.1136/gutjnl-2017-315136. PMID:30108163. URL: https://doi.org/10.1136/gutjnl-2017-315136. [PENDING-DOI-VERIFY]</w:t>
+        <w:t>[18] Zhou Q, Verne ML, Fields JZ, et al. Randomised placebo-controlled trial of dietary glutamine supplements for postinfectious irritable bowel syndrome. Gut. 2019;68(6):996-1002. doi:10.1136/gutjnl-2017-315136. PMID:30108163. URL: https://doi.org/10.1136/gutjnl-2017-315136. [DOI-VERIFIED 2026-07-17 ✓]</w:t>
       </w:r>
     </w:p>
     <w:p>
@@ -3114,7 +3130,7 @@
         <w:rPr>
           <w:rFonts w:ascii="Malgun Gothic" w:hAnsi="Malgun Gothic" w:eastAsia="Malgun Gothic"/>
         </w:rPr>
-        <w:t>[19] Baek JH, Jung S, Son H, et al. Glutamine Supplementation Prevents Chronic Stress-Induced Mild Cognitive Impairment. Nutrients. 2020;12(4):910. doi:10.3390/nu12040910. PMID:32224923. URL: https://doi.org/10.3390/nu12040910. [PENDING-DOI-VERIFY]</w:t>
+        <w:t>[19] Baek JH, Jung S, Son H, et al. Glutamine Supplementation Prevents Chronic Stress-Induced Mild Cognitive Impairment. Nutrients. 2020;12(4):910. doi:10.3390/nu12040910. PMID:32224923. URL: https://doi.org/10.3390/nu12040910. [DOI-VERIFIED 2026-07-17 ✓]</w:t>
       </w:r>
     </w:p>
     <w:p>
@@ -3122,7 +3138,7 @@
         <w:rPr>
           <w:rFonts w:ascii="Malgun Gothic" w:hAnsi="Malgun Gothic" w:eastAsia="Malgun Gothic"/>
         </w:rPr>
-        <w:t>[20] Dos Santos Quaresma M, Souza W, Lemos VA, et al. The Possible Importance of Glutamine Supplementation to Mood and Cognition in Hypoxia from High Altitude. Nutrients. 2020;12(12):3627. doi:10.3390/nu12123627. PMID:33255790. URL: https://doi.org/10.3390/nu12123627. [PENDING-DOI-VERIFY]</w:t>
+        <w:t>[20] Dos Santos Quaresma M, Souza W, Lemos VA, et al. The Possible Importance of Glutamine Supplementation to Mood and Cognition in Hypoxia from High Altitude. Nutrients. 2020;12(12):3627. doi:10.3390/nu12123627. PMID:33255790. URL: https://doi.org/10.3390/nu12123627. [DOI-VERIFIED 2026-07-17 ✓]</w:t>
       </w:r>
     </w:p>
     <w:p>
@@ -3130,7 +3146,7 @@
         <w:rPr>
           <w:rFonts w:ascii="Malgun Gothic" w:hAnsi="Malgun Gothic" w:eastAsia="Malgun Gothic"/>
         </w:rPr>
-        <w:t>[21] Zhou Y, Eid T, Hassel B, et al. Novel aspects of glutamine synthetase in ammonia homeostasis. Neurochemistry International. 2020;140:104809. doi:10.1016/j.neuint.2020.104809. PMID:32758585. URL: https://doi.org/10.1016/j.neuint.2020.104809. [PENDING-DOI-VERIFY]</w:t>
+        <w:t>[21] Zhou Y, Eid T, Hassel B, et al. Novel aspects of glutamine synthetase in ammonia homeostasis. Neurochemistry International. 2020;140:104809. doi:10.1016/j.neuint.2020.104809. PMID:32758585. URL: https://doi.org/10.1016/j.neuint.2020.104809. [DOI-VERIFIED 2026-07-17 ✓]</w:t>
       </w:r>
     </w:p>
     <w:p>
@@ -3138,7 +3154,7 @@
         <w:rPr>
           <w:rFonts w:ascii="Malgun Gothic" w:hAnsi="Malgun Gothic" w:eastAsia="Malgun Gothic"/>
         </w:rPr>
-        <w:t>[22] Severo JS, da Silva Barros VJ, Alves da Silva AC, et al. Effects of glutamine supplementation on inflammatory bowel disease: A systematic review of clinical trials. Clinical Nutrition ESPEN. 2021;42:53-60. doi:10.1016/j.clnesp.2020.12.023. PMID:33745622. URL: https://doi.org/10.1016/j.clnesp.2020.12.023. [PENDING-DOI-VERIFY]</w:t>
+        <w:t>[22] Severo JS, da Silva Barros VJ, Alves da Silva AC, et al. Effects of glutamine supplementation on inflammatory bowel disease: A systematic review of clinical trials. Clinical Nutrition ESPEN. 2021;42:53-60. doi:10.1016/j.clnesp.2020.12.023. PMID:33745622. URL: https://doi.org/10.1016/j.clnesp.2020.12.023. [DOI-VERIFIED 2026-07-17 ✓]</w:t>
       </w:r>
     </w:p>
     <w:p>
@@ -3146,7 +3162,7 @@
         <w:rPr>
           <w:rFonts w:ascii="Malgun Gothic" w:hAnsi="Malgun Gothic" w:eastAsia="Malgun Gothic"/>
         </w:rPr>
-        <w:t>[23] Truong V, Cheng PZ, Lee HC, et al. Occipital gamma-aminobutyric acid and glutamate-glutamine alterations in major depressive disorder: An MRS study and meta-analysis. Psychiatry Research: Neuroimaging. 2021;308:111238. doi:10.1016/j.pscychresns.2020.111238. PMID:33385764. URL: https://doi.org/10.1016/j.pscychresns.2020.111238. [PENDING-DOI-VERIFY]</w:t>
+        <w:t>[23] Truong V, Cheng PZ, Lee HC, et al. Occipital gamma-aminobutyric acid and glutamate-glutamine alterations in major depressive disorder: An MRS study and meta-analysis. Psychiatry Research: Neuroimaging. 2021;308:111238. doi:10.1016/j.pscychresns.2020.111238. PMID:33385764. URL: https://doi.org/10.1016/j.pscychresns.2020.111238. [DOI-VERIFIED 2026-07-17 ✓]</w:t>
       </w:r>
     </w:p>
     <w:p>
@@ -3154,7 +3170,7 @@
         <w:rPr>
           <w:rFonts w:ascii="Malgun Gothic" w:hAnsi="Malgun Gothic" w:eastAsia="Malgun Gothic"/>
         </w:rPr>
-        <w:t>[24] Yang T, Yan X, Cao Y, et al. Meta-analysis of Glutamine on Immune Function and Post-Operative Complications of Patients With Colorectal Cancer. Frontiers in Nutrition. 2021;8:765809. doi:10.3389/fnut.2021.765809. PMID:34938760. URL: https://doi.org/10.3389/fnut.2021.765809. [PENDING-DOI-VERIFY]</w:t>
+        <w:t>[24] Yang T, Yan X, Cao Y, et al. Meta-analysis of Glutamine on Immune Function and Post-Operative Complications of Patients With Colorectal Cancer. Frontiers in Nutrition. 2021;8:765809. doi:10.3389/fnut.2021.765809. PMID:34938760. URL: https://doi.org/10.3389/fnut.2021.765809. [DOI-VERIFIED 2026-07-17 ✓]</w:t>
       </w:r>
     </w:p>
     <w:p>
@@ -3162,7 +3178,7 @@
         <w:rPr>
           <w:rFonts w:ascii="Malgun Gothic" w:hAnsi="Malgun Gothic" w:eastAsia="Malgun Gothic"/>
         </w:rPr>
-        <w:t>[25] Cheung G, Bataveljic D, Visser J, et al. Physiological synaptic activity and recognition memory require astroglial glutamine. Nature Communications. 2022;13(1):753. doi:10.1038/s41467-022-28331-7. PMID:35136061. URL: https://doi.org/10.1038/s41467-022-28331-7. [PENDING-DOI-VERIFY]</w:t>
+        <w:t>[25] Cheung G, Bataveljic D, Visser J, et al. Physiological synaptic activity and recognition memory require astroglial glutamine. Nature Communications. 2022;13(1):753. doi:10.1038/s41467-022-28331-7. PMID:35136061. URL: https://doi.org/10.1038/s41467-022-28331-7. [DOI-VERIFIED 2026-07-17 ✓]</w:t>
       </w:r>
     </w:p>
     <w:p>
@@ -3170,7 +3186,7 @@
         <w:rPr>
           <w:rFonts w:ascii="Malgun Gothic" w:hAnsi="Malgun Gothic" w:eastAsia="Malgun Gothic"/>
         </w:rPr>
-        <w:t>[26] Gholamalizadeh M, Tabrizi R, Rezaei S, et al. Effect of glutamine supplementation on inflammatory markers in critically ill patients supported with enteral or parenteral feeding. JPEN. Journal of Parenteral and Enteral Nutrition. 2022;46(1):61-68. doi:10.1002/jpen.2217. PMID:34213769. URL: https://doi.org/10.1002/jpen.2217. [PENDING-DOI-VERIFY]</w:t>
+        <w:t>[26] Gholamalizadeh M, Tabrizi R, Rezaei S, et al. Effect of glutamine supplementation on inflammatory markers in critically ill patients supported with enteral or parenteral feeding. JPEN. Journal of Parenteral and Enteral Nutrition. 2022;46(1):61-68. doi:10.1002/jpen.2217. PMID:34213769. URL: https://doi.org/10.1002/jpen.2217. [DOI-VERIFIED 2026-07-17 ✓]</w:t>
       </w:r>
     </w:p>
     <w:p>
@@ -3178,7 +3194,7 @@
         <w:rPr>
           <w:rFonts w:ascii="Malgun Gothic" w:hAnsi="Malgun Gothic" w:eastAsia="Malgun Gothic"/>
         </w:rPr>
-        <w:t>[27] Heyland DK, Wibbenmeyer L, Pollack J, et al. A Randomized Trial of Enteral Glutamine for Treatment of Burn Injuries. The New England Journal of Medicine. 2022;387(11):1001-1010. doi:10.1056/NEJMoa2203364. PMID:36082909. URL: https://doi.org/10.1056/NEJMoa2203364. [PENDING-DOI-VERIFY]</w:t>
+        <w:t>[27] Heyland DK, Wibbenmeyer L, Pollack J, et al. A Randomized Trial of Enteral Glutamine for Treatment of Burn Injuries. The New England Journal of Medicine. 2022;387(11):1001-1010. doi:10.1056/NEJMoa2203364. PMID:36082909. URL: https://doi.org/10.1056/NEJMoa2203364. [DOI-VERIFIED 2026-07-17 ✓]</w:t>
       </w:r>
     </w:p>
     <w:p>
@@ -3186,7 +3202,7 @@
         <w:rPr>
           <w:rFonts w:ascii="Malgun Gothic" w:hAnsi="Malgun Gothic" w:eastAsia="Malgun Gothic"/>
         </w:rPr>
-        <w:t>[28] Hou YC, Wu JM, Chen KY, et al. Glutamine and leucine administration attenuates muscle atrophy in sepsis. Life Sciences. 2023;314:121327. doi:10.1016/j.lfs.2022.121327. PMID:36584912. URL: https://doi.org/10.1016/j.lfs.2022.121327. [PENDING-DOI-VERIFY]</w:t>
+        <w:t>[28] Hou YC, Wu JM, Chen KY, et al. Glutamine and leucine administration attenuates muscle atrophy in sepsis. Life Sciences. 2023;314:121327. doi:10.1016/j.lfs.2022.121327. PMID:36584912. URL: https://doi.org/10.1016/j.lfs.2022.121327. [DOI-VERIFIED 2026-07-17 ✓]</w:t>
       </w:r>
     </w:p>
     <w:p>
@@ -3194,7 +3210,7 @@
         <w:rPr>
           <w:rFonts w:ascii="Malgun Gothic" w:hAnsi="Malgun Gothic" w:eastAsia="Malgun Gothic"/>
         </w:rPr>
-        <w:t>[29] Li S, Wen X, Yang X, et al. Glutamine protects intestinal immunity through microbial metabolites rather than microbiota. International Immunopharmacology. 2023;124(Pt A):110832. doi:10.1016/j.intimp.2023.110832. PMID:37634449. URL: https://doi.org/10.1016/j.intimp.2023.110832. [PENDING-DOI-VERIFY]</w:t>
+        <w:t>[29] Li S, Wen X, Yang X, et al. Glutamine protects intestinal immunity through microbial metabolites rather than microbiota. International Immunopharmacology. 2023;124(Pt A):110832. doi:10.1016/j.intimp.2023.110832. PMID:37634449. URL: https://doi.org/10.1016/j.intimp.2023.110832. [DOI-VERIFIED 2026-07-17 ✓]</w:t>
       </w:r>
     </w:p>
     <w:p>
@@ -3202,7 +3218,7 @@
         <w:rPr>
           <w:rFonts w:ascii="Malgun Gothic" w:hAnsi="Malgun Gothic" w:eastAsia="Malgun Gothic"/>
         </w:rPr>
-        <w:t>[30] Lu T, Li Q, Lin W, et al. Gut Microbiota-Derived Glutamine Attenuates Liver Ischemia/Reperfusion Injury via Macrophage Metabolic Reprogramming. Cellular and Molecular Gastroenterology and Hepatology. 2023;15(5):1255-1275. doi:10.1016/j.jcmgh.2023.01.004. PMID:36706918. URL: https://doi.org/10.1016/j.jcmgh.2023.01.004. [PENDING-DOI-VERIFY]</w:t>
+        <w:t>[30] Lu T, Li Q, Lin W, et al. Gut Microbiota-Derived Glutamine Attenuates Liver Ischemia/Reperfusion Injury via Macrophage Metabolic Reprogramming. Cellular and Molecular Gastroenterology and Hepatology. 2023;15(5):1255-1275. doi:10.1016/j.jcmgh.2023.01.004. PMID:36706918. URL: https://doi.org/10.1016/j.jcmgh.2023.01.004. [DOI-VERIFIED 2026-07-17 ✓]</w:t>
       </w:r>
     </w:p>
     <w:p>
@@ -3210,7 +3226,7 @@
         <w:rPr>
           <w:rFonts w:ascii="Malgun Gothic" w:hAnsi="Malgun Gothic" w:eastAsia="Malgun Gothic"/>
         </w:rPr>
-        <w:t>[31] Oya M, Matsuoka K, Kubota M, et al. Increased glutamate and glutamine levels and their relationship to astrocytes and dopaminergic transmissions in the brains of adults with autism. Scientific Reports. 2023;13(1):11655. doi:10.1038/s41598-023-38306-3. PMID:37468523. URL: https://doi.org/10.1038/s41598-023-38306-3. [PENDING-DOI-VERIFY]</w:t>
+        <w:t>[31] Oya M, Matsuoka K, Kubota M, et al. Increased glutamate and glutamine levels and their relationship to astrocytes and dopaminergic transmissions in the brains of adults with autism. Scientific Reports. 2023;13(1):11655. doi:10.1038/s41598-023-38306-3. PMID:37468523. URL: https://doi.org/10.1038/s41598-023-38306-3. [DOI-VERIFIED 2026-07-17 ✓]</w:t>
       </w:r>
     </w:p>
     <w:p>
@@ -3218,7 +3234,7 @@
         <w:rPr>
           <w:rFonts w:ascii="Malgun Gothic" w:hAnsi="Malgun Gothic" w:eastAsia="Malgun Gothic"/>
         </w:rPr>
-        <w:t>[32] Abbasi F, Haghighat Lari MM, Khosravi GR, et al. A systematic review and meta-analysis of clinical trials on the effects of glutamine supplementation on gut permeability in adults. Amino Acids. 2024;56(1):60. doi:10.1007/s00726-024-03420-7. PMID:39397201. URL: https://doi.org/10.1007/s00726-024-03420-7. [PENDING-DOI-VERIFY]</w:t>
+        <w:t>[32] Abbasi F, Haghighat Lari MM, Khosravi GR, et al. A systematic review and meta-analysis of clinical trials on the effects of glutamine supplementation on gut permeability in adults. Amino Acids. 2024;56(1):60. doi:10.1007/s00726-024-03420-7. PMID:39397201. URL: https://doi.org/10.1007/s00726-024-03420-7. [DOI-VERIFIED 2026-07-17 ✓]</w:t>
       </w:r>
     </w:p>
     <w:p>
@@ -3226,7 +3242,7 @@
         <w:rPr>
           <w:rFonts w:ascii="Malgun Gothic" w:hAnsi="Malgun Gothic" w:eastAsia="Malgun Gothic"/>
         </w:rPr>
-        <w:t>[33] Baek JH, Park H, Kang H, et al. The Role of Glutamine Homeostasis in Emotional and Cognitive Functions. International Journal of Molecular Sciences. 2024;25(2):1302. doi:10.3390/ijms25021302. PMID:38279303. URL: https://doi.org/10.3390/ijms25021302. [PENDING-DOI-VERIFY]</w:t>
+        <w:t>[33] Baek JH, Park H, Kang H, et al. The Role of Glutamine Homeostasis in Emotional and Cognitive Functions. International Journal of Molecular Sciences. 2024;25(2):1302. doi:10.3390/ijms25021302. PMID:38279303. URL: https://doi.org/10.3390/ijms25021302. [DOI-VERIFIED 2026-07-17 ✓]</w:t>
       </w:r>
     </w:p>
     <w:p>
@@ -3234,7 +3250,7 @@
         <w:rPr>
           <w:rFonts w:ascii="Malgun Gothic" w:hAnsi="Malgun Gothic" w:eastAsia="Malgun Gothic"/>
         </w:rPr>
-        <w:t>[34] Tao W, Xu G, Zhou J, et al. Glutamine Supplementation on Burn Patients: A Systematic Review and Meta-analysis. Journal of Burn Care &amp; Research. 2024;45(3):675-684. doi:10.1093/jbcr/irae007. PMID:38243579. URL: https://doi.org/10.1093/jbcr/irae007. [PENDING-DOI-VERIFY]</w:t>
+        <w:t>[34] Tao W, Xu G, Zhou J, et al. Glutamine Supplementation on Burn Patients: A Systematic Review and Meta-analysis. Journal of Burn Care &amp; Research. 2024;45(3):675-684. doi:10.1093/jbcr/irae007. PMID:38243579. URL: https://doi.org/10.1093/jbcr/irae007. [DOI-VERIFIED 2026-07-17 ✓]</w:t>
       </w:r>
     </w:p>
     <w:p>
@@ -3242,7 +3258,7 @@
         <w:rPr>
           <w:rFonts w:ascii="Malgun Gothic" w:hAnsi="Malgun Gothic" w:eastAsia="Malgun Gothic"/>
         </w:rPr>
-        <w:t>[35] Andersen JV. The Glutamate/GABA-Glutamine Cycle: Insights, Updates, and Advances. Journal of Neurochemistry. 2025;169(3):e70029. doi:10.1111/jnc.70029. PMID:40066661. URL: https://doi.org/10.1111/jnc.70029. [PENDING-DOI-VERIFY]</w:t>
+        <w:t>[35] Andersen JV. The Glutamate/GABA-Glutamine Cycle: Insights, Updates, and Advances. Journal of Neurochemistry. 2025;169(3):e70029. doi:10.1111/jnc.70029. PMID:40066661. URL: https://doi.org/10.1111/jnc.70029. [DOI-VERIFIED 2026-07-17 ✓]</w:t>
       </w:r>
     </w:p>
     <w:p>
@@ -3250,7 +3266,7 @@
         <w:rPr>
           <w:rFonts w:ascii="Malgun Gothic" w:hAnsi="Malgun Gothic" w:eastAsia="Malgun Gothic"/>
         </w:rPr>
-        <w:t>[36] Wang J, He Y, Liu Z, et al. Glutamine Peptides: Preparation, Analysis, Applications, and Their Role in Intestinal Barrier Protection. Nutrients. 2025;17(6):1017. doi:10.3390/nu17061017. PMID:40290078. URL: https://doi.org/10.3390/nu17061017. [PENDING-DOI-VERIFY]</w:t>
+        <w:t>[36] Wang J, He Y, Liu Z, et al. Glutamine Peptides: Preparation, Analysis, Applications, and Their Role in Intestinal Barrier Protection. Nutrients. 2025;17(6):1017. doi:10.3390/nu17061017. PMID:40290078. URL: https://doi.org/10.3390/nu17061017. [DOI-VERIFIED 2026-07-17 ✓]</w:t>
       </w:r>
     </w:p>
     <w:p>
@@ -3258,7 +3274,7 @@
         <w:rPr>
           <w:rFonts w:ascii="Malgun Gothic" w:hAnsi="Malgun Gothic" w:eastAsia="Malgun Gothic"/>
         </w:rPr>
-        <w:t>[37] Raghu R, Chinnathambi S. Glutamate-Glutamine metabolism and transport, implications in Parkinson's disease. International Review of Neurobiology. 2026;186:75-106. doi:10.1016/bs.irn.2026.01.001. PMID:42276624. URL: https://doi.org/10.1016/bs.irn.2026.01.001. [PENDING-DOI-VERIFY]</w:t>
+        <w:t>[37] Raghu R, Chinnathambi S. Glutamate-Glutamine metabolism and transport, implications in Parkinson's disease. International Review of Neurobiology. 2026;186:75-106. doi:10.1016/bs.irn.2026.01.001. PMID:42276624. URL: https://doi.org/10.1016/bs.irn.2026.01.001. [DOI-VERIFIED 2026-07-17 ✓]</w:t>
       </w:r>
     </w:p>
     <w:p>
@@ -3266,7 +3282,7 @@
         <w:rPr>
           <w:rFonts w:ascii="Malgun Gothic" w:hAnsi="Malgun Gothic" w:eastAsia="Malgun Gothic"/>
         </w:rPr>
-        <w:t>[38] de Souza SRG, Martins Perles JVC, Bossolani GDP, et al. Glial remodeling and neuroprotective effects of L-glutamine supplementation on the enteric nervous system in walker-256 tumor-bearing rats. Tissue &amp; Cell. 2026;102:103652. doi:10.1016/j.tice.2026.103652. PMID:42217296. URL: https://doi.org/10.1016/j.tice.2026.103652. [PENDING-DOI-VERIFY]</w:t>
+        <w:t>[38] de Souza SRG, Martins Perles JVC, Bossolani GDP, et al. Glial remodeling and neuroprotective effects of L-glutamine supplementation on the enteric nervous system in walker-256 tumor-bearing rats. Tissue &amp; Cell. 2026;102:103652. doi:10.1016/j.tice.2026.103652. PMID:42217296. URL: https://doi.org/10.1016/j.tice.2026.103652. [DOI-VERIFIED 2026-07-17 ✓]</w:t>
       </w:r>
     </w:p>
     <w:p>
@@ -3335,7 +3351,7 @@
         <w:rPr>
           <w:rFonts w:ascii="Malgun Gothic" w:hAnsi="Malgun Gothic" w:eastAsia="Malgun Gothic"/>
         </w:rPr>
-        <w:t>(PubMed 실측 수집) 유래 · [PENDING-DOI-VERIFY]</w:t>
+        <w:t>(PubMed 실측 수집) 유래 · [DOI-VERIFIED 2026-07-17 ✓] 38/38 (검증률 100%)</w:t>
       </w:r>
     </w:p>
     <w:p>
@@ -3424,13 +3440,13 @@
           <w:rFonts w:ascii="Malgun Gothic" w:hAnsi="Malgun Gothic" w:eastAsia="Malgun Gothic"/>
           <w:b/>
         </w:rPr>
-        <w:t>KFDA 준수 초벌:</w:t>
-      </w:r>
-      <w:r>
-        <w:rPr>
-          <w:rFonts w:ascii="Malgun Gothic" w:hAnsi="Malgun Gothic" w:eastAsia="Malgun Gothic"/>
-        </w:rPr>
-        <w:t xml:space="preserve"> 힘뇌장에 대한 효능 주장 0건 · "부위·조건 의존적 지지 가능성"으로 한정 서술 · chapter-editor(단계 ④) 최종 점검 대상</w:t>
+        <w:t>KFDA 준수:</w:t>
+      </w:r>
+      <w:r>
+        <w:rPr>
+          <w:rFonts w:ascii="Malgun Gothic" w:hAnsi="Malgun Gothic" w:eastAsia="Malgun Gothic"/>
+        </w:rPr>
+        <w:t xml:space="preserve"> 힘뇌장에 대한 효능 주장 0건 · "부위·조건 의존적 지지 가능성"으로 한정 서술 · declarative 금지어(치료·예방·완치·특효) 0건 · chapter-editor(단계 ④) 점검 완료</w:t>
       </w:r>
     </w:p>
     <w:p>
@@ -3443,13 +3459,32 @@
           <w:rFonts w:ascii="Malgun Gothic" w:hAnsi="Malgun Gothic" w:eastAsia="Malgun Gothic"/>
           <w:b/>
         </w:rPr>
-        <w:t>다음 단계:</w:t>
-      </w:r>
-      <w:r>
-        <w:rPr>
-          <w:rFonts w:ascii="Malgun Gothic" w:hAnsi="Malgun Gothic" w:eastAsia="Malgun Gothic"/>
-        </w:rPr>
-        <w:t xml:space="preserve"> reference-validator(단계 ③) → chapter-editor(단계 ④)</w:t>
+        <w:t>워크플로우:</w:t>
+      </w:r>
+      <w:r>
+        <w:rPr>
+          <w:rFonts w:ascii="Malgun Gothic" w:hAnsi="Malgun Gothic" w:eastAsia="Malgun Gothic"/>
+        </w:rPr>
+        <w:t xml:space="preserve"> reference-validator(단계 ③, 38/38 DOI-VERIFIED) → chapter-editor(단계 ④, 용어·인용·톤 점검) 완료 · 저자(최성화 교수) 최종 승인 대기</w:t>
+      </w:r>
+    </w:p>
+    <w:p>
+      <w:pPr>
+        <w:pStyle w:val="ListBullet"/>
+      </w:pPr>
+      <w:r/>
+      <w:r>
+        <w:rPr>
+          <w:rFonts w:ascii="Malgun Gothic" w:hAnsi="Malgun Gothic" w:eastAsia="Malgun Gothic"/>
+          <w:b/>
+        </w:rPr>
+        <w:t>미결(저자 승인 필요):</w:t>
+      </w:r>
+      <w:r>
+        <w:rPr>
+          <w:rFonts w:ascii="Malgun Gothic" w:hAnsi="Malgun Gothic" w:eastAsia="Malgun Gothic"/>
+        </w:rPr>
+        <w:t xml:space="preserve"> §9.3 FDA·MFDS 규제 URL은 [PENDING-URL-VERIFY] 상태(임의 번호 생성 금지 방침으로 공란) · 1차 규제문서 대조 후 확정</w:t>
       </w:r>
     </w:p>
     <w:p>

</xml_diff>